<commit_message>
docs: finalize Security Self-Assessment Report and build publication-grade DOCX
</commit_message>
<xml_diff>
--- a/docs/Orvilo_Execution_Evidence_Report.docx
+++ b/docs/Orvilo_Execution_Evidence_Report.docx
@@ -700,7 +700,7 @@
                 <w:color w:val="334155"/>
                 <w:sz w:val="17"/>
               </w:rPr>
-              <w:t>32dcdae (32dcdaedf5a723154a9b29b65f7cdab0d28e4d53)</w:t>
+              <w:t>f81167f (f81167fa7430931318597559e9b8dd806eae8508)</w:t>
             </w:r>
           </w:p>
         </w:tc>
@@ -2395,7 +2395,7 @@
                 <w:color w:val="334155"/>
                 <w:sz w:val="16"/>
               </w:rPr>
-              <w:t>32dcdae</w:t>
+              <w:t>f81167f</w:t>
             </w:r>
           </w:p>
         </w:tc>
@@ -2421,7 +2421,7 @@
                 <w:color w:val="334155"/>
                 <w:sz w:val="16"/>
               </w:rPr>
-              <w:t>Updated to latest commit (32dcdaedf5a723154a9b29b65f7cdab0d28e4d53).</w:t>
+              <w:t>Updated to latest commit (f81167fa7430931318597559e9b8dd806eae8508).</w:t>
             </w:r>
           </w:p>
         </w:tc>

</xml_diff>